<commit_message>
Fix stale title and v1 version DOI in data availability statement and cover letter (both now cite the concept DOI)
</commit_message>
<xml_diff>
--- a/paper/data_availability/data_availability_statement.docx
+++ b/paper/data_availability/data_availability_statement.docx
@@ -26,7 +26,7 @@
         <w:t xml:space="preserve"> </w:t>
       </w:r>
       <w:r>
-        <w:t xml:space="preserve">Finite-temperature dynamic stability is a blind spot of foundation machine-learning interatomic potentials</w:t>
+        <w:t xml:space="preserve">Finite-temperature dynamic stability separates foundation machine-learning interatomic potentials that harmonic benchmarks rank equally</w:t>
       </w:r>
       <w:r>
         <w:t xml:space="preserve"> </w:t>
@@ -62,7 +62,13 @@
         <w:t xml:space="preserve"> </w:t>
       </w:r>
       <w:r>
-        <w:t xml:space="preserve">https://doi.org/10.5281/zenodo.20805824. The production results regenerate from</w:t>
+        <w:t xml:space="preserve">https://doi.org/10.5281/zenodo.20805799 (concept DOI, resolving to the latest version). The</w:t>
+      </w:r>
+      <w:r>
+        <w:t xml:space="preserve"> </w:t>
+      </w:r>
+      <w:r>
+        <w:t xml:space="preserve">production results regenerate from</w:t>
       </w:r>
       <w:r>
         <w:t xml:space="preserve"> </w:t>
@@ -77,7 +83,13 @@
         <w:t xml:space="preserve"> </w:t>
       </w:r>
       <w:r>
-        <w:t xml:space="preserve">(per-unit hashed, resumable) and the finite-size runs from</w:t>
+        <w:t xml:space="preserve">(per-unit hashed, resumable) and the</w:t>
+      </w:r>
+      <w:r>
+        <w:t xml:space="preserve"> </w:t>
+      </w:r>
+      <w:r>
+        <w:t xml:space="preserve">finite-size runs from</w:t>
       </w:r>
       <w:r>
         <w:t xml:space="preserve"> </w:t>
@@ -101,7 +113,13 @@
         <w:t xml:space="preserve">scripts/make_figures.py</w:t>
       </w:r>
       <w:r>
-        <w:t xml:space="preserve">, analysis in</w:t>
+        <w:t xml:space="preserve">,</w:t>
+      </w:r>
+      <w:r>
+        <w:t xml:space="preserve"> </w:t>
+      </w:r>
+      <w:r>
+        <w:t xml:space="preserve">analysis in</w:t>
       </w:r>
       <w:r>
         <w:t xml:space="preserve"> </w:t>
@@ -125,13 +143,7 @@
         <w:t xml:space="preserve">scripts/sscha_v4_diag.py</w:t>
       </w:r>
       <w:r>
-        <w:t xml:space="preserve">, and the</w:t>
-      </w:r>
-      <w:r>
-        <w:t xml:space="preserve"> </w:t>
-      </w:r>
-      <w:r>
-        <w:t xml:space="preserve">stochastic-reproducibility study (§3.5) via</w:t>
+        <w:t xml:space="preserve">, and the stochastic-reproducibility study (§3.5) via</w:t>
       </w:r>
       <w:r>
         <w:t xml:space="preserve"> </w:t>
@@ -146,13 +158,76 @@
         <w:t xml:space="preserve"> </w:t>
       </w:r>
       <w:r>
-        <w:t xml:space="preserve">(its per-seed frequencies</w:t>
-      </w:r>
-      <w:r>
-        <w:t xml:space="preserve"> </w:t>
-      </w:r>
-      <w:r>
-        <w:t xml:space="preserve">print to the run log rather than to the ledger).</w:t>
+        <w:t xml:space="preserve">(its per-seed frequencies print to the run log rather than to the</w:t>
+      </w:r>
+      <w:r>
+        <w:t xml:space="preserve"> </w:t>
+      </w:r>
+      <w:r>
+        <w:t xml:space="preserve">ledger). The SSCHA results reported are a full re-measurement (</w:t>
+      </w:r>
+      <w:r>
+        <w:rPr>
+          <w:rStyle w:val="VerbatimChar"/>
+        </w:rPr>
+        <w:t xml:space="preserve">scripts/run_sscha_v2.py</w:t>
+      </w:r>
+      <w:r>
+        <w:t xml:space="preserve">, method</w:t>
+      </w:r>
+      <w:r>
+        <w:t xml:space="preserve"> </w:t>
+      </w:r>
+      <w:r>
+        <w:t xml:space="preserve">version 3) of the original 208-unit grid in pinned environments (</w:t>
+      </w:r>
+      <w:r>
+        <w:rPr>
+          <w:rStyle w:val="VerbatimChar"/>
+        </w:rPr>
+        <w:t xml:space="preserve">envs/lock-*.txt</w:t>
+      </w:r>
+      <w:r>
+        <w:t xml:space="preserve">); superseded</w:t>
+      </w:r>
+      <w:r>
+        <w:t xml:space="preserve"> </w:t>
+      </w:r>
+      <w:r>
+        <w:t xml:space="preserve">generations are retained in the append-only ledger, with</w:t>
+      </w:r>
+      <w:r>
+        <w:t xml:space="preserve"> </w:t>
+      </w:r>
+      <w:r>
+        <w:rPr>
+          <w:rStyle w:val="VerbatimChar"/>
+        </w:rPr>
+        <w:t xml:space="preserve">mlip_dynstab.analysis.canonical</w:t>
+      </w:r>
+      <w:r>
+        <w:t xml:space="preserve"> </w:t>
+      </w:r>
+      <w:r>
+        <w:t xml:space="preserve">selecting the current one, so every stage of the correction is auditable. Every headline number in</w:t>
+      </w:r>
+      <w:r>
+        <w:t xml:space="preserve"> </w:t>
+      </w:r>
+      <w:r>
+        <w:t xml:space="preserve">the manuscript is asserted against the ledger by</w:t>
+      </w:r>
+      <w:r>
+        <w:t xml:space="preserve"> </w:t>
+      </w:r>
+      <w:r>
+        <w:rPr>
+          <w:rStyle w:val="VerbatimChar"/>
+        </w:rPr>
+        <w:t xml:space="preserve">scripts/verify_claims.py</w:t>
+      </w:r>
+      <w:r>
+        <w:t xml:space="preserve">.</w:t>
       </w:r>
     </w:p>
     <w:bookmarkEnd w:id="9"/>

</xml_diff>